<commit_message>
Fix documentation and add test
</commit_message>
<xml_diff>
--- a/doc/process.docx
+++ b/doc/process.docx
@@ -1,6 +1,6 @@
 
 <file path=word/document.xml><?xml version="1.0" encoding="utf-8"?>
-<w:document xmlns:wpc="http://schemas.microsoft.com/office/word/2010/wordprocessingCanvas" xmlns:cx="http://schemas.microsoft.com/office/drawing/2014/chartex" xmlns:cx1="http://schemas.microsoft.com/office/drawing/2015/9/8/chartex" xmlns:cx2="http://schemas.microsoft.com/office/drawing/2015/10/21/chartex" xmlns:cx3="http://schemas.microsoft.com/office/drawing/2016/5/9/chartex" xmlns:cx4="http://schemas.microsoft.com/office/drawing/2016/5/10/chartex" xmlns:cx5="http://schemas.microsoft.com/office/drawing/2016/5/11/chartex" xmlns:cx6="http://schemas.microsoft.com/office/drawing/2016/5/12/chartex" xmlns:cx7="http://schemas.microsoft.com/office/drawing/2016/5/13/chartex" xmlns:cx8="http://schemas.microsoft.com/office/drawing/2016/5/14/chartex" xmlns:mc="http://schemas.openxmlformats.org/markup-compatibility/2006" xmlns:aink="http://schemas.microsoft.com/office/drawing/2016/ink" xmlns:am3d="http://schemas.microsoft.com/office/drawing/2017/model3d" xmlns:o="urn:schemas-microsoft-com:office:office" xmlns:oel="http://schemas.microsoft.com/office/2019/extlst" xmlns:r="http://schemas.openxmlformats.org/officeDocument/2006/relationships" xmlns:m="http://schemas.openxmlformats.org/officeDocument/2006/math" xmlns:v="urn:schemas-microsoft-com:vml" xmlns:wp14="http://schemas.microsoft.com/office/word/2010/wordprocessingDrawing" xmlns:wp="http://schemas.openxmlformats.org/drawingml/2006/wordprocessingDrawing" xmlns:w10="urn:schemas-microsoft-com:office:word" xmlns:w="http://schemas.openxmlformats.org/wordprocessingml/2006/main" xmlns:w14="http://schemas.microsoft.com/office/word/2010/wordml" xmlns:w15="http://schemas.microsoft.com/office/word/2012/wordml" xmlns:w16cex="http://schemas.microsoft.com/office/word/2018/wordml/cex" xmlns:w16cid="http://schemas.microsoft.com/office/word/2016/wordml/cid" xmlns:w16="http://schemas.microsoft.com/office/word/2018/wordml" xmlns:w16du="http://schemas.microsoft.com/office/word/2023/wordml/word16du" xmlns:w16sdtdh="http://schemas.microsoft.com/office/word/2020/wordml/sdtdatahash" xmlns:w16se="http://schemas.microsoft.com/office/word/2015/wordml/symex" xmlns:wpg="http://schemas.microsoft.com/office/word/2010/wordprocessingGroup" xmlns:wpi="http://schemas.microsoft.com/office/word/2010/wordprocessingInk" xmlns:wne="http://schemas.microsoft.com/office/word/2006/wordml" xmlns:wps="http://schemas.microsoft.com/office/word/2010/wordprocessingShape" mc:Ignorable="w14 w15 w16se w16cid w16 w16cex w16sdtdh w16du wp14">
+<w:document xmlns:wpc="http://schemas.microsoft.com/office/word/2010/wordprocessingCanvas" xmlns:cx="http://schemas.microsoft.com/office/drawing/2014/chartex" xmlns:cx1="http://schemas.microsoft.com/office/drawing/2015/9/8/chartex" xmlns:cx2="http://schemas.microsoft.com/office/drawing/2015/10/21/chartex" xmlns:cx3="http://schemas.microsoft.com/office/drawing/2016/5/9/chartex" xmlns:cx4="http://schemas.microsoft.com/office/drawing/2016/5/10/chartex" xmlns:cx5="http://schemas.microsoft.com/office/drawing/2016/5/11/chartex" xmlns:cx6="http://schemas.microsoft.com/office/drawing/2016/5/12/chartex" xmlns:cx7="http://schemas.microsoft.com/office/drawing/2016/5/13/chartex" xmlns:cx8="http://schemas.microsoft.com/office/drawing/2016/5/14/chartex" xmlns:mc="http://schemas.openxmlformats.org/markup-compatibility/2006" xmlns:aink="http://schemas.microsoft.com/office/drawing/2016/ink" xmlns:am3d="http://schemas.microsoft.com/office/drawing/2017/model3d" xmlns:o="urn:schemas-microsoft-com:office:office" xmlns:oel="http://schemas.microsoft.com/office/2019/extlst" xmlns:r="http://schemas.openxmlformats.org/officeDocument/2006/relationships" xmlns:m="http://schemas.openxmlformats.org/officeDocument/2006/math" xmlns:v="urn:schemas-microsoft-com:vml" xmlns:wp14="http://schemas.microsoft.com/office/word/2010/wordprocessingDrawing" xmlns:wp="http://schemas.openxmlformats.org/drawingml/2006/wordprocessingDrawing" xmlns:w10="urn:schemas-microsoft-com:office:word" xmlns:w="http://schemas.openxmlformats.org/wordprocessingml/2006/main" xmlns:w14="http://schemas.microsoft.com/office/word/2010/wordml" xmlns:w15="http://schemas.microsoft.com/office/word/2012/wordml" xmlns:w16cex="http://schemas.microsoft.com/office/word/2018/wordml/cex" xmlns:w16cid="http://schemas.microsoft.com/office/word/2016/wordml/cid" xmlns:w16="http://schemas.microsoft.com/office/word/2018/wordml" xmlns:w16du="http://schemas.microsoft.com/office/word/2023/wordml/word16du" xmlns:w16sdtdh="http://schemas.microsoft.com/office/word/2020/wordml/sdtdatahash" xmlns:w16sdtfl="http://schemas.microsoft.com/office/word/2024/wordml/sdtformatlock" xmlns:w16se="http://schemas.microsoft.com/office/word/2015/wordml/symex" xmlns:wpg="http://schemas.microsoft.com/office/word/2010/wordprocessingGroup" xmlns:wpi="http://schemas.microsoft.com/office/word/2010/wordprocessingInk" xmlns:wne="http://schemas.microsoft.com/office/word/2006/wordml" xmlns:wps="http://schemas.microsoft.com/office/word/2010/wordprocessingShape" mc:Ignorable="w14 w15 w16se w16cid w16 w16cex w16sdtdh w16sdtfl w16du wp14">
   <w:body>
     <w:p>
       <w:r>
@@ -80,7 +80,7 @@
                                 <w:color w:val="000000" w:themeColor="text1"/>
                                 <w:lang w:val="en-US"/>
                               </w:rPr>
-                              <w:t>Consumer</w:t>
+                              <w:t>Producer</w:t>
                             </w:r>
                             <w:r>
                               <w:rPr>
@@ -173,7 +173,7 @@
                           <w:color w:val="000000" w:themeColor="text1"/>
                           <w:lang w:val="en-US"/>
                         </w:rPr>
-                        <w:t>Consumer</w:t>
+                        <w:t>Producer</w:t>
                       </w:r>
                       <w:r>
                         <w:rPr>
@@ -1252,7 +1252,7 @@
                                 <w:color w:val="000000" w:themeColor="text1"/>
                                 <w:lang w:val="en-US"/>
                               </w:rPr>
-                              <w:t>Consumer</w:t>
+                              <w:t>Producer</w:t>
                             </w:r>
                             <w:r>
                               <w:rPr>
@@ -1285,7 +1285,10 @@
           </mc:Choice>
           <mc:Fallback>
             <w:pict>
-              <v:shape w14:anchorId="2BC4E06E" id="Flowchart: Connector 33" o:spid="_x0000_s1031" type="#_x0000_t120" style="position:absolute;margin-left:151.8pt;margin-top:172.25pt;width:89.25pt;height:80.25pt;z-index:251734016;visibility:visible;mso-wrap-style:square;mso-width-percent:0;mso-height-percent:0;mso-wrap-distance-left:9pt;mso-wrap-distance-top:0;mso-wrap-distance-right:9pt;mso-wrap-distance-bottom:0;mso-position-horizontal:absolute;mso-position-horizontal-relative:text;mso-position-vertical:absolute;mso-position-vertical-relative:text;mso-width-percent:0;mso-height-percent:0;mso-width-relative:margin;mso-height-relative:margin;v-text-anchor:middle" o:gfxdata="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" fillcolor="white [3212]" strokecolor="black [3213]" strokeweight="2pt">
+              <v:shapetype w14:anchorId="2BC4E06E" id="_x0000_t120" coordsize="21600,21600" o:spt="120" path="m10800,qx,10800,10800,21600,21600,10800,10800,xe">
+                <v:path gradientshapeok="t" o:connecttype="custom" o:connectlocs="10800,0;3163,3163;0,10800;3163,18437;10800,21600;18437,18437;21600,10800;18437,3163" textboxrect="3163,3163,18437,18437"/>
+              </v:shapetype>
+              <v:shape id="Flowchart: Connector 33" o:spid="_x0000_s1031" type="#_x0000_t120" style="position:absolute;margin-left:151.8pt;margin-top:172.25pt;width:89.25pt;height:80.25pt;z-index:251734016;visibility:visible;mso-wrap-style:square;mso-width-percent:0;mso-height-percent:0;mso-wrap-distance-left:9pt;mso-wrap-distance-top:0;mso-wrap-distance-right:9pt;mso-wrap-distance-bottom:0;mso-position-horizontal:absolute;mso-position-horizontal-relative:text;mso-position-vertical:absolute;mso-position-vertical-relative:text;mso-width-percent:0;mso-height-percent:0;mso-width-relative:margin;mso-height-relative:margin;v-text-anchor:middle" o:gfxdata="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" fillcolor="white [3212]" strokecolor="black [3213]" strokeweight="2pt">
                 <v:stroke joinstyle="miter"/>
                 <v:textbox>
                   <w:txbxContent>
@@ -1303,7 +1306,7 @@
                           <w:color w:val="000000" w:themeColor="text1"/>
                           <w:lang w:val="en-US"/>
                         </w:rPr>
-                        <w:t>Consumer</w:t>
+                        <w:t>Producer</w:t>
                       </w:r>
                       <w:r>
                         <w:rPr>
@@ -2078,7 +2081,14 @@
                                 <w:color w:val="000000" w:themeColor="text1"/>
                                 <w:lang w:val="en-US"/>
                               </w:rPr>
-                              <w:t>Producer puts event to error Topic</w:t>
+                              <w:t>Consumer</w:t>
+                            </w:r>
+                            <w:r>
+                              <w:rPr>
+                                <w:color w:val="000000" w:themeColor="text1"/>
+                                <w:lang w:val="en-US"/>
+                              </w:rPr>
+                              <w:t xml:space="preserve"> puts event to error Topic</w:t>
                             </w:r>
                           </w:p>
                         </w:txbxContent>
@@ -2118,7 +2128,14 @@
                           <w:color w:val="000000" w:themeColor="text1"/>
                           <w:lang w:val="en-US"/>
                         </w:rPr>
-                        <w:t>Producer puts event to error Topic</w:t>
+                        <w:t>Consumer</w:t>
+                      </w:r>
+                      <w:r>
+                        <w:rPr>
+                          <w:color w:val="000000" w:themeColor="text1"/>
+                          <w:lang w:val="en-US"/>
+                        </w:rPr>
+                        <w:t xml:space="preserve"> puts event to error Topic</w:t>
                       </w:r>
                     </w:p>
                   </w:txbxContent>
@@ -2396,8 +2413,17 @@
                                 <w:color w:val="000000" w:themeColor="text1"/>
                                 <w:lang w:val="en-US"/>
                               </w:rPr>
-                              <w:t>Producer</w:t>
+                              <w:t>Consumer</w:t>
                             </w:r>
+                          </w:p>
+                          <w:p>
+                            <w:pPr>
+                              <w:rPr>
+                                <w:b/>
+                                <w:color w:val="000000" w:themeColor="text1"/>
+                                <w:lang w:val="en-US"/>
+                              </w:rPr>
+                            </w:pPr>
                             <w:r>
                               <w:rPr>
                                 <w:b/>
@@ -2447,8 +2473,17 @@
                           <w:color w:val="000000" w:themeColor="text1"/>
                           <w:lang w:val="en-US"/>
                         </w:rPr>
-                        <w:t>Producer</w:t>
+                        <w:t>Consumer</w:t>
                       </w:r>
+                    </w:p>
+                    <w:p>
+                      <w:pPr>
+                        <w:rPr>
+                          <w:b/>
+                          <w:color w:val="000000" w:themeColor="text1"/>
+                          <w:lang w:val="en-US"/>
+                        </w:rPr>
+                      </w:pPr>
                       <w:r>
                         <w:rPr>
                           <w:b/>
@@ -3052,7 +3087,7 @@
 </file>
 
 <file path=word/endnotes.xml><?xml version="1.0" encoding="utf-8"?>
-<w:endnotes xmlns:wpc="http://schemas.microsoft.com/office/word/2010/wordprocessingCanvas" xmlns:cx="http://schemas.microsoft.com/office/drawing/2014/chartex" xmlns:cx1="http://schemas.microsoft.com/office/drawing/2015/9/8/chartex" xmlns:cx2="http://schemas.microsoft.com/office/drawing/2015/10/21/chartex" xmlns:cx3="http://schemas.microsoft.com/office/drawing/2016/5/9/chartex" xmlns:cx4="http://schemas.microsoft.com/office/drawing/2016/5/10/chartex" xmlns:cx5="http://schemas.microsoft.com/office/drawing/2016/5/11/chartex" xmlns:cx6="http://schemas.microsoft.com/office/drawing/2016/5/12/chartex" xmlns:cx7="http://schemas.microsoft.com/office/drawing/2016/5/13/chartex" xmlns:cx8="http://schemas.microsoft.com/office/drawing/2016/5/14/chartex" xmlns:mc="http://schemas.openxmlformats.org/markup-compatibility/2006" xmlns:aink="http://schemas.microsoft.com/office/drawing/2016/ink" xmlns:am3d="http://schemas.microsoft.com/office/drawing/2017/model3d" xmlns:o="urn:schemas-microsoft-com:office:office" xmlns:oel="http://schemas.microsoft.com/office/2019/extlst" xmlns:r="http://schemas.openxmlformats.org/officeDocument/2006/relationships" xmlns:m="http://schemas.openxmlformats.org/officeDocument/2006/math" xmlns:v="urn:schemas-microsoft-com:vml" xmlns:wp14="http://schemas.microsoft.com/office/word/2010/wordprocessingDrawing" xmlns:wp="http://schemas.openxmlformats.org/drawingml/2006/wordprocessingDrawing" xmlns:w10="urn:schemas-microsoft-com:office:word" xmlns:w="http://schemas.openxmlformats.org/wordprocessingml/2006/main" xmlns:w14="http://schemas.microsoft.com/office/word/2010/wordml" xmlns:w15="http://schemas.microsoft.com/office/word/2012/wordml" xmlns:w16cex="http://schemas.microsoft.com/office/word/2018/wordml/cex" xmlns:w16cid="http://schemas.microsoft.com/office/word/2016/wordml/cid" xmlns:w16="http://schemas.microsoft.com/office/word/2018/wordml" xmlns:w16du="http://schemas.microsoft.com/office/word/2023/wordml/word16du" xmlns:w16sdtdh="http://schemas.microsoft.com/office/word/2020/wordml/sdtdatahash" xmlns:w16se="http://schemas.microsoft.com/office/word/2015/wordml/symex" xmlns:wpg="http://schemas.microsoft.com/office/word/2010/wordprocessingGroup" xmlns:wpi="http://schemas.microsoft.com/office/word/2010/wordprocessingInk" xmlns:wne="http://schemas.microsoft.com/office/word/2006/wordml" xmlns:wps="http://schemas.microsoft.com/office/word/2010/wordprocessingShape" mc:Ignorable="w14 w15 w16se w16cid w16 w16cex w16sdtdh w16du wp14">
+<w:endnotes xmlns:wpc="http://schemas.microsoft.com/office/word/2010/wordprocessingCanvas" xmlns:cx="http://schemas.microsoft.com/office/drawing/2014/chartex" xmlns:cx1="http://schemas.microsoft.com/office/drawing/2015/9/8/chartex" xmlns:cx2="http://schemas.microsoft.com/office/drawing/2015/10/21/chartex" xmlns:cx3="http://schemas.microsoft.com/office/drawing/2016/5/9/chartex" xmlns:cx4="http://schemas.microsoft.com/office/drawing/2016/5/10/chartex" xmlns:cx5="http://schemas.microsoft.com/office/drawing/2016/5/11/chartex" xmlns:cx6="http://schemas.microsoft.com/office/drawing/2016/5/12/chartex" xmlns:cx7="http://schemas.microsoft.com/office/drawing/2016/5/13/chartex" xmlns:cx8="http://schemas.microsoft.com/office/drawing/2016/5/14/chartex" xmlns:mc="http://schemas.openxmlformats.org/markup-compatibility/2006" xmlns:aink="http://schemas.microsoft.com/office/drawing/2016/ink" xmlns:am3d="http://schemas.microsoft.com/office/drawing/2017/model3d" xmlns:o="urn:schemas-microsoft-com:office:office" xmlns:oel="http://schemas.microsoft.com/office/2019/extlst" xmlns:r="http://schemas.openxmlformats.org/officeDocument/2006/relationships" xmlns:m="http://schemas.openxmlformats.org/officeDocument/2006/math" xmlns:v="urn:schemas-microsoft-com:vml" xmlns:wp14="http://schemas.microsoft.com/office/word/2010/wordprocessingDrawing" xmlns:wp="http://schemas.openxmlformats.org/drawingml/2006/wordprocessingDrawing" xmlns:w10="urn:schemas-microsoft-com:office:word" xmlns:w="http://schemas.openxmlformats.org/wordprocessingml/2006/main" xmlns:w14="http://schemas.microsoft.com/office/word/2010/wordml" xmlns:w15="http://schemas.microsoft.com/office/word/2012/wordml" xmlns:w16cex="http://schemas.microsoft.com/office/word/2018/wordml/cex" xmlns:w16cid="http://schemas.microsoft.com/office/word/2016/wordml/cid" xmlns:w16="http://schemas.microsoft.com/office/word/2018/wordml" xmlns:w16du="http://schemas.microsoft.com/office/word/2023/wordml/word16du" xmlns:w16sdtdh="http://schemas.microsoft.com/office/word/2020/wordml/sdtdatahash" xmlns:w16sdtfl="http://schemas.microsoft.com/office/word/2024/wordml/sdtformatlock" xmlns:w16se="http://schemas.microsoft.com/office/word/2015/wordml/symex" xmlns:wpg="http://schemas.microsoft.com/office/word/2010/wordprocessingGroup" xmlns:wpi="http://schemas.microsoft.com/office/word/2010/wordprocessingInk" xmlns:wne="http://schemas.microsoft.com/office/word/2006/wordml" xmlns:wps="http://schemas.microsoft.com/office/word/2010/wordprocessingShape" mc:Ignorable="w14 w15 w16se w16cid w16 w16cex w16sdtdh w16sdtfl w16du wp14">
   <w:endnote w:type="separator" w:id="-1">
     <w:p>
       <w:pPr>
@@ -3077,7 +3112,7 @@
 </file>
 
 <file path=word/footer1.xml><?xml version="1.0" encoding="utf-8"?>
-<w:ftr xmlns:wpc="http://schemas.microsoft.com/office/word/2010/wordprocessingCanvas" xmlns:cx="http://schemas.microsoft.com/office/drawing/2014/chartex" xmlns:cx1="http://schemas.microsoft.com/office/drawing/2015/9/8/chartex" xmlns:cx2="http://schemas.microsoft.com/office/drawing/2015/10/21/chartex" xmlns:cx3="http://schemas.microsoft.com/office/drawing/2016/5/9/chartex" xmlns:cx4="http://schemas.microsoft.com/office/drawing/2016/5/10/chartex" xmlns:cx5="http://schemas.microsoft.com/office/drawing/2016/5/11/chartex" xmlns:cx6="http://schemas.microsoft.com/office/drawing/2016/5/12/chartex" xmlns:cx7="http://schemas.microsoft.com/office/drawing/2016/5/13/chartex" xmlns:cx8="http://schemas.microsoft.com/office/drawing/2016/5/14/chartex" xmlns:mc="http://schemas.openxmlformats.org/markup-compatibility/2006" xmlns:aink="http://schemas.microsoft.com/office/drawing/2016/ink" xmlns:am3d="http://schemas.microsoft.com/office/drawing/2017/model3d" xmlns:o="urn:schemas-microsoft-com:office:office" xmlns:oel="http://schemas.microsoft.com/office/2019/extlst" xmlns:r="http://schemas.openxmlformats.org/officeDocument/2006/relationships" xmlns:m="http://schemas.openxmlformats.org/officeDocument/2006/math" xmlns:v="urn:schemas-microsoft-com:vml" xmlns:wp14="http://schemas.microsoft.com/office/word/2010/wordprocessingDrawing" xmlns:wp="http://schemas.openxmlformats.org/drawingml/2006/wordprocessingDrawing" xmlns:w10="urn:schemas-microsoft-com:office:word" xmlns:w="http://schemas.openxmlformats.org/wordprocessingml/2006/main" xmlns:w14="http://schemas.microsoft.com/office/word/2010/wordml" xmlns:w15="http://schemas.microsoft.com/office/word/2012/wordml" xmlns:w16cex="http://schemas.microsoft.com/office/word/2018/wordml/cex" xmlns:w16cid="http://schemas.microsoft.com/office/word/2016/wordml/cid" xmlns:w16="http://schemas.microsoft.com/office/word/2018/wordml" xmlns:w16du="http://schemas.microsoft.com/office/word/2023/wordml/word16du" xmlns:w16sdtdh="http://schemas.microsoft.com/office/word/2020/wordml/sdtdatahash" xmlns:w16se="http://schemas.microsoft.com/office/word/2015/wordml/symex" xmlns:wpg="http://schemas.microsoft.com/office/word/2010/wordprocessingGroup" xmlns:wpi="http://schemas.microsoft.com/office/word/2010/wordprocessingInk" xmlns:wne="http://schemas.microsoft.com/office/word/2006/wordml" xmlns:wps="http://schemas.microsoft.com/office/word/2010/wordprocessingShape" mc:Ignorable="w14 w15 w16se w16cid w16 w16cex w16sdtdh w16du wp14">
+<w:ftr xmlns:wpc="http://schemas.microsoft.com/office/word/2010/wordprocessingCanvas" xmlns:cx="http://schemas.microsoft.com/office/drawing/2014/chartex" xmlns:cx1="http://schemas.microsoft.com/office/drawing/2015/9/8/chartex" xmlns:cx2="http://schemas.microsoft.com/office/drawing/2015/10/21/chartex" xmlns:cx3="http://schemas.microsoft.com/office/drawing/2016/5/9/chartex" xmlns:cx4="http://schemas.microsoft.com/office/drawing/2016/5/10/chartex" xmlns:cx5="http://schemas.microsoft.com/office/drawing/2016/5/11/chartex" xmlns:cx6="http://schemas.microsoft.com/office/drawing/2016/5/12/chartex" xmlns:cx7="http://schemas.microsoft.com/office/drawing/2016/5/13/chartex" xmlns:cx8="http://schemas.microsoft.com/office/drawing/2016/5/14/chartex" xmlns:mc="http://schemas.openxmlformats.org/markup-compatibility/2006" xmlns:aink="http://schemas.microsoft.com/office/drawing/2016/ink" xmlns:am3d="http://schemas.microsoft.com/office/drawing/2017/model3d" xmlns:o="urn:schemas-microsoft-com:office:office" xmlns:oel="http://schemas.microsoft.com/office/2019/extlst" xmlns:r="http://schemas.openxmlformats.org/officeDocument/2006/relationships" xmlns:m="http://schemas.openxmlformats.org/officeDocument/2006/math" xmlns:v="urn:schemas-microsoft-com:vml" xmlns:wp14="http://schemas.microsoft.com/office/word/2010/wordprocessingDrawing" xmlns:wp="http://schemas.openxmlformats.org/drawingml/2006/wordprocessingDrawing" xmlns:w10="urn:schemas-microsoft-com:office:word" xmlns:w="http://schemas.openxmlformats.org/wordprocessingml/2006/main" xmlns:w14="http://schemas.microsoft.com/office/word/2010/wordml" xmlns:w15="http://schemas.microsoft.com/office/word/2012/wordml" xmlns:w16cex="http://schemas.microsoft.com/office/word/2018/wordml/cex" xmlns:w16cid="http://schemas.microsoft.com/office/word/2016/wordml/cid" xmlns:w16="http://schemas.microsoft.com/office/word/2018/wordml" xmlns:w16du="http://schemas.microsoft.com/office/word/2023/wordml/word16du" xmlns:w16sdtdh="http://schemas.microsoft.com/office/word/2020/wordml/sdtdatahash" xmlns:w16sdtfl="http://schemas.microsoft.com/office/word/2024/wordml/sdtformatlock" xmlns:w16se="http://schemas.microsoft.com/office/word/2015/wordml/symex" xmlns:wpg="http://schemas.microsoft.com/office/word/2010/wordprocessingGroup" xmlns:wpi="http://schemas.microsoft.com/office/word/2010/wordprocessingInk" xmlns:wne="http://schemas.microsoft.com/office/word/2006/wordml" xmlns:wps="http://schemas.microsoft.com/office/word/2010/wordprocessingShape" mc:Ignorable="w14 w15 w16se w16cid w16 w16cex w16sdtdh w16sdtfl w16du wp14">
   <w:p>
     <w:pPr>
       <w:pStyle w:val="Fuzeile"/>
@@ -3087,7 +3122,7 @@
 </file>
 
 <file path=word/footer2.xml><?xml version="1.0" encoding="utf-8"?>
-<w:ftr xmlns:wpc="http://schemas.microsoft.com/office/word/2010/wordprocessingCanvas" xmlns:cx="http://schemas.microsoft.com/office/drawing/2014/chartex" xmlns:cx1="http://schemas.microsoft.com/office/drawing/2015/9/8/chartex" xmlns:cx2="http://schemas.microsoft.com/office/drawing/2015/10/21/chartex" xmlns:cx3="http://schemas.microsoft.com/office/drawing/2016/5/9/chartex" xmlns:cx4="http://schemas.microsoft.com/office/drawing/2016/5/10/chartex" xmlns:cx5="http://schemas.microsoft.com/office/drawing/2016/5/11/chartex" xmlns:cx6="http://schemas.microsoft.com/office/drawing/2016/5/12/chartex" xmlns:cx7="http://schemas.microsoft.com/office/drawing/2016/5/13/chartex" xmlns:cx8="http://schemas.microsoft.com/office/drawing/2016/5/14/chartex" xmlns:mc="http://schemas.openxmlformats.org/markup-compatibility/2006" xmlns:aink="http://schemas.microsoft.com/office/drawing/2016/ink" xmlns:am3d="http://schemas.microsoft.com/office/drawing/2017/model3d" xmlns:o="urn:schemas-microsoft-com:office:office" xmlns:oel="http://schemas.microsoft.com/office/2019/extlst" xmlns:r="http://schemas.openxmlformats.org/officeDocument/2006/relationships" xmlns:m="http://schemas.openxmlformats.org/officeDocument/2006/math" xmlns:v="urn:schemas-microsoft-com:vml" xmlns:wp14="http://schemas.microsoft.com/office/word/2010/wordprocessingDrawing" xmlns:wp="http://schemas.openxmlformats.org/drawingml/2006/wordprocessingDrawing" xmlns:w10="urn:schemas-microsoft-com:office:word" xmlns:w="http://schemas.openxmlformats.org/wordprocessingml/2006/main" xmlns:w14="http://schemas.microsoft.com/office/word/2010/wordml" xmlns:w15="http://schemas.microsoft.com/office/word/2012/wordml" xmlns:w16cex="http://schemas.microsoft.com/office/word/2018/wordml/cex" xmlns:w16cid="http://schemas.microsoft.com/office/word/2016/wordml/cid" xmlns:w16="http://schemas.microsoft.com/office/word/2018/wordml" xmlns:w16du="http://schemas.microsoft.com/office/word/2023/wordml/word16du" xmlns:w16sdtdh="http://schemas.microsoft.com/office/word/2020/wordml/sdtdatahash" xmlns:w16se="http://schemas.microsoft.com/office/word/2015/wordml/symex" xmlns:wpg="http://schemas.microsoft.com/office/word/2010/wordprocessingGroup" xmlns:wpi="http://schemas.microsoft.com/office/word/2010/wordprocessingInk" xmlns:wne="http://schemas.microsoft.com/office/word/2006/wordml" xmlns:wps="http://schemas.microsoft.com/office/word/2010/wordprocessingShape" mc:Ignorable="w14 w15 w16se w16cid w16 w16cex w16sdtdh w16du wp14">
+<w:ftr xmlns:wpc="http://schemas.microsoft.com/office/word/2010/wordprocessingCanvas" xmlns:cx="http://schemas.microsoft.com/office/drawing/2014/chartex" xmlns:cx1="http://schemas.microsoft.com/office/drawing/2015/9/8/chartex" xmlns:cx2="http://schemas.microsoft.com/office/drawing/2015/10/21/chartex" xmlns:cx3="http://schemas.microsoft.com/office/drawing/2016/5/9/chartex" xmlns:cx4="http://schemas.microsoft.com/office/drawing/2016/5/10/chartex" xmlns:cx5="http://schemas.microsoft.com/office/drawing/2016/5/11/chartex" xmlns:cx6="http://schemas.microsoft.com/office/drawing/2016/5/12/chartex" xmlns:cx7="http://schemas.microsoft.com/office/drawing/2016/5/13/chartex" xmlns:cx8="http://schemas.microsoft.com/office/drawing/2016/5/14/chartex" xmlns:mc="http://schemas.openxmlformats.org/markup-compatibility/2006" xmlns:aink="http://schemas.microsoft.com/office/drawing/2016/ink" xmlns:am3d="http://schemas.microsoft.com/office/drawing/2017/model3d" xmlns:o="urn:schemas-microsoft-com:office:office" xmlns:oel="http://schemas.microsoft.com/office/2019/extlst" xmlns:r="http://schemas.openxmlformats.org/officeDocument/2006/relationships" xmlns:m="http://schemas.openxmlformats.org/officeDocument/2006/math" xmlns:v="urn:schemas-microsoft-com:vml" xmlns:wp14="http://schemas.microsoft.com/office/word/2010/wordprocessingDrawing" xmlns:wp="http://schemas.openxmlformats.org/drawingml/2006/wordprocessingDrawing" xmlns:w10="urn:schemas-microsoft-com:office:word" xmlns:w="http://schemas.openxmlformats.org/wordprocessingml/2006/main" xmlns:w14="http://schemas.microsoft.com/office/word/2010/wordml" xmlns:w15="http://schemas.microsoft.com/office/word/2012/wordml" xmlns:w16cex="http://schemas.microsoft.com/office/word/2018/wordml/cex" xmlns:w16cid="http://schemas.microsoft.com/office/word/2016/wordml/cid" xmlns:w16="http://schemas.microsoft.com/office/word/2018/wordml" xmlns:w16du="http://schemas.microsoft.com/office/word/2023/wordml/word16du" xmlns:w16sdtdh="http://schemas.microsoft.com/office/word/2020/wordml/sdtdatahash" xmlns:w16sdtfl="http://schemas.microsoft.com/office/word/2024/wordml/sdtformatlock" xmlns:w16se="http://schemas.microsoft.com/office/word/2015/wordml/symex" xmlns:wpg="http://schemas.microsoft.com/office/word/2010/wordprocessingGroup" xmlns:wpi="http://schemas.microsoft.com/office/word/2010/wordprocessingInk" xmlns:wne="http://schemas.microsoft.com/office/word/2006/wordml" xmlns:wps="http://schemas.microsoft.com/office/word/2010/wordprocessingShape" mc:Ignorable="w14 w15 w16se w16cid w16 w16cex w16sdtdh w16sdtfl w16du wp14">
   <w:p>
     <w:pPr>
       <w:pStyle w:val="Fuzeile"/>
@@ -3097,7 +3132,7 @@
 </file>
 
 <file path=word/footer3.xml><?xml version="1.0" encoding="utf-8"?>
-<w:ftr xmlns:wpc="http://schemas.microsoft.com/office/word/2010/wordprocessingCanvas" xmlns:cx="http://schemas.microsoft.com/office/drawing/2014/chartex" xmlns:cx1="http://schemas.microsoft.com/office/drawing/2015/9/8/chartex" xmlns:cx2="http://schemas.microsoft.com/office/drawing/2015/10/21/chartex" xmlns:cx3="http://schemas.microsoft.com/office/drawing/2016/5/9/chartex" xmlns:cx4="http://schemas.microsoft.com/office/drawing/2016/5/10/chartex" xmlns:cx5="http://schemas.microsoft.com/office/drawing/2016/5/11/chartex" xmlns:cx6="http://schemas.microsoft.com/office/drawing/2016/5/12/chartex" xmlns:cx7="http://schemas.microsoft.com/office/drawing/2016/5/13/chartex" xmlns:cx8="http://schemas.microsoft.com/office/drawing/2016/5/14/chartex" xmlns:mc="http://schemas.openxmlformats.org/markup-compatibility/2006" xmlns:aink="http://schemas.microsoft.com/office/drawing/2016/ink" xmlns:am3d="http://schemas.microsoft.com/office/drawing/2017/model3d" xmlns:o="urn:schemas-microsoft-com:office:office" xmlns:oel="http://schemas.microsoft.com/office/2019/extlst" xmlns:r="http://schemas.openxmlformats.org/officeDocument/2006/relationships" xmlns:m="http://schemas.openxmlformats.org/officeDocument/2006/math" xmlns:v="urn:schemas-microsoft-com:vml" xmlns:wp14="http://schemas.microsoft.com/office/word/2010/wordprocessingDrawing" xmlns:wp="http://schemas.openxmlformats.org/drawingml/2006/wordprocessingDrawing" xmlns:w10="urn:schemas-microsoft-com:office:word" xmlns:w="http://schemas.openxmlformats.org/wordprocessingml/2006/main" xmlns:w14="http://schemas.microsoft.com/office/word/2010/wordml" xmlns:w15="http://schemas.microsoft.com/office/word/2012/wordml" xmlns:w16cex="http://schemas.microsoft.com/office/word/2018/wordml/cex" xmlns:w16cid="http://schemas.microsoft.com/office/word/2016/wordml/cid" xmlns:w16="http://schemas.microsoft.com/office/word/2018/wordml" xmlns:w16du="http://schemas.microsoft.com/office/word/2023/wordml/word16du" xmlns:w16sdtdh="http://schemas.microsoft.com/office/word/2020/wordml/sdtdatahash" xmlns:w16se="http://schemas.microsoft.com/office/word/2015/wordml/symex" xmlns:wpg="http://schemas.microsoft.com/office/word/2010/wordprocessingGroup" xmlns:wpi="http://schemas.microsoft.com/office/word/2010/wordprocessingInk" xmlns:wne="http://schemas.microsoft.com/office/word/2006/wordml" xmlns:wps="http://schemas.microsoft.com/office/word/2010/wordprocessingShape" mc:Ignorable="w14 w15 w16se w16cid w16 w16cex w16sdtdh w16du wp14">
+<w:ftr xmlns:wpc="http://schemas.microsoft.com/office/word/2010/wordprocessingCanvas" xmlns:cx="http://schemas.microsoft.com/office/drawing/2014/chartex" xmlns:cx1="http://schemas.microsoft.com/office/drawing/2015/9/8/chartex" xmlns:cx2="http://schemas.microsoft.com/office/drawing/2015/10/21/chartex" xmlns:cx3="http://schemas.microsoft.com/office/drawing/2016/5/9/chartex" xmlns:cx4="http://schemas.microsoft.com/office/drawing/2016/5/10/chartex" xmlns:cx5="http://schemas.microsoft.com/office/drawing/2016/5/11/chartex" xmlns:cx6="http://schemas.microsoft.com/office/drawing/2016/5/12/chartex" xmlns:cx7="http://schemas.microsoft.com/office/drawing/2016/5/13/chartex" xmlns:cx8="http://schemas.microsoft.com/office/drawing/2016/5/14/chartex" xmlns:mc="http://schemas.openxmlformats.org/markup-compatibility/2006" xmlns:aink="http://schemas.microsoft.com/office/drawing/2016/ink" xmlns:am3d="http://schemas.microsoft.com/office/drawing/2017/model3d" xmlns:o="urn:schemas-microsoft-com:office:office" xmlns:oel="http://schemas.microsoft.com/office/2019/extlst" xmlns:r="http://schemas.openxmlformats.org/officeDocument/2006/relationships" xmlns:m="http://schemas.openxmlformats.org/officeDocument/2006/math" xmlns:v="urn:schemas-microsoft-com:vml" xmlns:wp14="http://schemas.microsoft.com/office/word/2010/wordprocessingDrawing" xmlns:wp="http://schemas.openxmlformats.org/drawingml/2006/wordprocessingDrawing" xmlns:w10="urn:schemas-microsoft-com:office:word" xmlns:w="http://schemas.openxmlformats.org/wordprocessingml/2006/main" xmlns:w14="http://schemas.microsoft.com/office/word/2010/wordml" xmlns:w15="http://schemas.microsoft.com/office/word/2012/wordml" xmlns:w16cex="http://schemas.microsoft.com/office/word/2018/wordml/cex" xmlns:w16cid="http://schemas.microsoft.com/office/word/2016/wordml/cid" xmlns:w16="http://schemas.microsoft.com/office/word/2018/wordml" xmlns:w16du="http://schemas.microsoft.com/office/word/2023/wordml/word16du" xmlns:w16sdtdh="http://schemas.microsoft.com/office/word/2020/wordml/sdtdatahash" xmlns:w16sdtfl="http://schemas.microsoft.com/office/word/2024/wordml/sdtformatlock" xmlns:w16se="http://schemas.microsoft.com/office/word/2015/wordml/symex" xmlns:wpg="http://schemas.microsoft.com/office/word/2010/wordprocessingGroup" xmlns:wpi="http://schemas.microsoft.com/office/word/2010/wordprocessingInk" xmlns:wne="http://schemas.microsoft.com/office/word/2006/wordml" xmlns:wps="http://schemas.microsoft.com/office/word/2010/wordprocessingShape" mc:Ignorable="w14 w15 w16se w16cid w16 w16cex w16sdtdh w16sdtfl w16du wp14">
   <w:p>
     <w:pPr>
       <w:pStyle w:val="Fuzeile"/>
@@ -3107,7 +3142,7 @@
 </file>
 
 <file path=word/footnotes.xml><?xml version="1.0" encoding="utf-8"?>
-<w:footnotes xmlns:wpc="http://schemas.microsoft.com/office/word/2010/wordprocessingCanvas" xmlns:cx="http://schemas.microsoft.com/office/drawing/2014/chartex" xmlns:cx1="http://schemas.microsoft.com/office/drawing/2015/9/8/chartex" xmlns:cx2="http://schemas.microsoft.com/office/drawing/2015/10/21/chartex" xmlns:cx3="http://schemas.microsoft.com/office/drawing/2016/5/9/chartex" xmlns:cx4="http://schemas.microsoft.com/office/drawing/2016/5/10/chartex" xmlns:cx5="http://schemas.microsoft.com/office/drawing/2016/5/11/chartex" xmlns:cx6="http://schemas.microsoft.com/office/drawing/2016/5/12/chartex" xmlns:cx7="http://schemas.microsoft.com/office/drawing/2016/5/13/chartex" xmlns:cx8="http://schemas.microsoft.com/office/drawing/2016/5/14/chartex" xmlns:mc="http://schemas.openxmlformats.org/markup-compatibility/2006" xmlns:aink="http://schemas.microsoft.com/office/drawing/2016/ink" xmlns:am3d="http://schemas.microsoft.com/office/drawing/2017/model3d" xmlns:o="urn:schemas-microsoft-com:office:office" xmlns:oel="http://schemas.microsoft.com/office/2019/extlst" xmlns:r="http://schemas.openxmlformats.org/officeDocument/2006/relationships" xmlns:m="http://schemas.openxmlformats.org/officeDocument/2006/math" xmlns:v="urn:schemas-microsoft-com:vml" xmlns:wp14="http://schemas.microsoft.com/office/word/2010/wordprocessingDrawing" xmlns:wp="http://schemas.openxmlformats.org/drawingml/2006/wordprocessingDrawing" xmlns:w10="urn:schemas-microsoft-com:office:word" xmlns:w="http://schemas.openxmlformats.org/wordprocessingml/2006/main" xmlns:w14="http://schemas.microsoft.com/office/word/2010/wordml" xmlns:w15="http://schemas.microsoft.com/office/word/2012/wordml" xmlns:w16cex="http://schemas.microsoft.com/office/word/2018/wordml/cex" xmlns:w16cid="http://schemas.microsoft.com/office/word/2016/wordml/cid" xmlns:w16="http://schemas.microsoft.com/office/word/2018/wordml" xmlns:w16du="http://schemas.microsoft.com/office/word/2023/wordml/word16du" xmlns:w16sdtdh="http://schemas.microsoft.com/office/word/2020/wordml/sdtdatahash" xmlns:w16se="http://schemas.microsoft.com/office/word/2015/wordml/symex" xmlns:wpg="http://schemas.microsoft.com/office/word/2010/wordprocessingGroup" xmlns:wpi="http://schemas.microsoft.com/office/word/2010/wordprocessingInk" xmlns:wne="http://schemas.microsoft.com/office/word/2006/wordml" xmlns:wps="http://schemas.microsoft.com/office/word/2010/wordprocessingShape" mc:Ignorable="w14 w15 w16se w16cid w16 w16cex w16sdtdh w16du wp14">
+<w:footnotes xmlns:wpc="http://schemas.microsoft.com/office/word/2010/wordprocessingCanvas" xmlns:cx="http://schemas.microsoft.com/office/drawing/2014/chartex" xmlns:cx1="http://schemas.microsoft.com/office/drawing/2015/9/8/chartex" xmlns:cx2="http://schemas.microsoft.com/office/drawing/2015/10/21/chartex" xmlns:cx3="http://schemas.microsoft.com/office/drawing/2016/5/9/chartex" xmlns:cx4="http://schemas.microsoft.com/office/drawing/2016/5/10/chartex" xmlns:cx5="http://schemas.microsoft.com/office/drawing/2016/5/11/chartex" xmlns:cx6="http://schemas.microsoft.com/office/drawing/2016/5/12/chartex" xmlns:cx7="http://schemas.microsoft.com/office/drawing/2016/5/13/chartex" xmlns:cx8="http://schemas.microsoft.com/office/drawing/2016/5/14/chartex" xmlns:mc="http://schemas.openxmlformats.org/markup-compatibility/2006" xmlns:aink="http://schemas.microsoft.com/office/drawing/2016/ink" xmlns:am3d="http://schemas.microsoft.com/office/drawing/2017/model3d" xmlns:o="urn:schemas-microsoft-com:office:office" xmlns:oel="http://schemas.microsoft.com/office/2019/extlst" xmlns:r="http://schemas.openxmlformats.org/officeDocument/2006/relationships" xmlns:m="http://schemas.openxmlformats.org/officeDocument/2006/math" xmlns:v="urn:schemas-microsoft-com:vml" xmlns:wp14="http://schemas.microsoft.com/office/word/2010/wordprocessingDrawing" xmlns:wp="http://schemas.openxmlformats.org/drawingml/2006/wordprocessingDrawing" xmlns:w10="urn:schemas-microsoft-com:office:word" xmlns:w="http://schemas.openxmlformats.org/wordprocessingml/2006/main" xmlns:w14="http://schemas.microsoft.com/office/word/2010/wordml" xmlns:w15="http://schemas.microsoft.com/office/word/2012/wordml" xmlns:w16cex="http://schemas.microsoft.com/office/word/2018/wordml/cex" xmlns:w16cid="http://schemas.microsoft.com/office/word/2016/wordml/cid" xmlns:w16="http://schemas.microsoft.com/office/word/2018/wordml" xmlns:w16du="http://schemas.microsoft.com/office/word/2023/wordml/word16du" xmlns:w16sdtdh="http://schemas.microsoft.com/office/word/2020/wordml/sdtdatahash" xmlns:w16sdtfl="http://schemas.microsoft.com/office/word/2024/wordml/sdtformatlock" xmlns:w16se="http://schemas.microsoft.com/office/word/2015/wordml/symex" xmlns:wpg="http://schemas.microsoft.com/office/word/2010/wordprocessingGroup" xmlns:wpi="http://schemas.microsoft.com/office/word/2010/wordprocessingInk" xmlns:wne="http://schemas.microsoft.com/office/word/2006/wordml" xmlns:wps="http://schemas.microsoft.com/office/word/2010/wordprocessingShape" mc:Ignorable="w14 w15 w16se w16cid w16 w16cex w16sdtdh w16sdtfl w16du wp14">
   <w:footnote w:type="separator" w:id="-1">
     <w:p>
       <w:pPr>
@@ -3132,7 +3167,7 @@
 </file>
 
 <file path=word/header1.xml><?xml version="1.0" encoding="utf-8"?>
-<w:hdr xmlns:wpc="http://schemas.microsoft.com/office/word/2010/wordprocessingCanvas" xmlns:cx="http://schemas.microsoft.com/office/drawing/2014/chartex" xmlns:cx1="http://schemas.microsoft.com/office/drawing/2015/9/8/chartex" xmlns:cx2="http://schemas.microsoft.com/office/drawing/2015/10/21/chartex" xmlns:cx3="http://schemas.microsoft.com/office/drawing/2016/5/9/chartex" xmlns:cx4="http://schemas.microsoft.com/office/drawing/2016/5/10/chartex" xmlns:cx5="http://schemas.microsoft.com/office/drawing/2016/5/11/chartex" xmlns:cx6="http://schemas.microsoft.com/office/drawing/2016/5/12/chartex" xmlns:cx7="http://schemas.microsoft.com/office/drawing/2016/5/13/chartex" xmlns:cx8="http://schemas.microsoft.com/office/drawing/2016/5/14/chartex" xmlns:mc="http://schemas.openxmlformats.org/markup-compatibility/2006" xmlns:aink="http://schemas.microsoft.com/office/drawing/2016/ink" xmlns:am3d="http://schemas.microsoft.com/office/drawing/2017/model3d" xmlns:o="urn:schemas-microsoft-com:office:office" xmlns:oel="http://schemas.microsoft.com/office/2019/extlst" xmlns:r="http://schemas.openxmlformats.org/officeDocument/2006/relationships" xmlns:m="http://schemas.openxmlformats.org/officeDocument/2006/math" xmlns:v="urn:schemas-microsoft-com:vml" xmlns:wp14="http://schemas.microsoft.com/office/word/2010/wordprocessingDrawing" xmlns:wp="http://schemas.openxmlformats.org/drawingml/2006/wordprocessingDrawing" xmlns:w10="urn:schemas-microsoft-com:office:word" xmlns:w="http://schemas.openxmlformats.org/wordprocessingml/2006/main" xmlns:w14="http://schemas.microsoft.com/office/word/2010/wordml" xmlns:w15="http://schemas.microsoft.com/office/word/2012/wordml" xmlns:w16cex="http://schemas.microsoft.com/office/word/2018/wordml/cex" xmlns:w16cid="http://schemas.microsoft.com/office/word/2016/wordml/cid" xmlns:w16="http://schemas.microsoft.com/office/word/2018/wordml" xmlns:w16du="http://schemas.microsoft.com/office/word/2023/wordml/word16du" xmlns:w16sdtdh="http://schemas.microsoft.com/office/word/2020/wordml/sdtdatahash" xmlns:w16se="http://schemas.microsoft.com/office/word/2015/wordml/symex" xmlns:wpg="http://schemas.microsoft.com/office/word/2010/wordprocessingGroup" xmlns:wpi="http://schemas.microsoft.com/office/word/2010/wordprocessingInk" xmlns:wne="http://schemas.microsoft.com/office/word/2006/wordml" xmlns:wps="http://schemas.microsoft.com/office/word/2010/wordprocessingShape" mc:Ignorable="w14 w15 w16se w16cid w16 w16cex w16sdtdh w16du wp14">
+<w:hdr xmlns:wpc="http://schemas.microsoft.com/office/word/2010/wordprocessingCanvas" xmlns:cx="http://schemas.microsoft.com/office/drawing/2014/chartex" xmlns:cx1="http://schemas.microsoft.com/office/drawing/2015/9/8/chartex" xmlns:cx2="http://schemas.microsoft.com/office/drawing/2015/10/21/chartex" xmlns:cx3="http://schemas.microsoft.com/office/drawing/2016/5/9/chartex" xmlns:cx4="http://schemas.microsoft.com/office/drawing/2016/5/10/chartex" xmlns:cx5="http://schemas.microsoft.com/office/drawing/2016/5/11/chartex" xmlns:cx6="http://schemas.microsoft.com/office/drawing/2016/5/12/chartex" xmlns:cx7="http://schemas.microsoft.com/office/drawing/2016/5/13/chartex" xmlns:cx8="http://schemas.microsoft.com/office/drawing/2016/5/14/chartex" xmlns:mc="http://schemas.openxmlformats.org/markup-compatibility/2006" xmlns:aink="http://schemas.microsoft.com/office/drawing/2016/ink" xmlns:am3d="http://schemas.microsoft.com/office/drawing/2017/model3d" xmlns:o="urn:schemas-microsoft-com:office:office" xmlns:oel="http://schemas.microsoft.com/office/2019/extlst" xmlns:r="http://schemas.openxmlformats.org/officeDocument/2006/relationships" xmlns:m="http://schemas.openxmlformats.org/officeDocument/2006/math" xmlns:v="urn:schemas-microsoft-com:vml" xmlns:wp14="http://schemas.microsoft.com/office/word/2010/wordprocessingDrawing" xmlns:wp="http://schemas.openxmlformats.org/drawingml/2006/wordprocessingDrawing" xmlns:w10="urn:schemas-microsoft-com:office:word" xmlns:w="http://schemas.openxmlformats.org/wordprocessingml/2006/main" xmlns:w14="http://schemas.microsoft.com/office/word/2010/wordml" xmlns:w15="http://schemas.microsoft.com/office/word/2012/wordml" xmlns:w16cex="http://schemas.microsoft.com/office/word/2018/wordml/cex" xmlns:w16cid="http://schemas.microsoft.com/office/word/2016/wordml/cid" xmlns:w16="http://schemas.microsoft.com/office/word/2018/wordml" xmlns:w16du="http://schemas.microsoft.com/office/word/2023/wordml/word16du" xmlns:w16sdtdh="http://schemas.microsoft.com/office/word/2020/wordml/sdtdatahash" xmlns:w16sdtfl="http://schemas.microsoft.com/office/word/2024/wordml/sdtformatlock" xmlns:w16se="http://schemas.microsoft.com/office/word/2015/wordml/symex" xmlns:wpg="http://schemas.microsoft.com/office/word/2010/wordprocessingGroup" xmlns:wpi="http://schemas.microsoft.com/office/word/2010/wordprocessingInk" xmlns:wne="http://schemas.microsoft.com/office/word/2006/wordml" xmlns:wps="http://schemas.microsoft.com/office/word/2010/wordprocessingShape" mc:Ignorable="w14 w15 w16se w16cid w16 w16cex w16sdtdh w16sdtfl w16du wp14">
   <w:p>
     <w:pPr>
       <w:pStyle w:val="Kopfzeile"/>
@@ -3142,7 +3177,7 @@
 </file>
 
 <file path=word/header2.xml><?xml version="1.0" encoding="utf-8"?>
-<w:hdr xmlns:wpc="http://schemas.microsoft.com/office/word/2010/wordprocessingCanvas" xmlns:cx="http://schemas.microsoft.com/office/drawing/2014/chartex" xmlns:cx1="http://schemas.microsoft.com/office/drawing/2015/9/8/chartex" xmlns:cx2="http://schemas.microsoft.com/office/drawing/2015/10/21/chartex" xmlns:cx3="http://schemas.microsoft.com/office/drawing/2016/5/9/chartex" xmlns:cx4="http://schemas.microsoft.com/office/drawing/2016/5/10/chartex" xmlns:cx5="http://schemas.microsoft.com/office/drawing/2016/5/11/chartex" xmlns:cx6="http://schemas.microsoft.com/office/drawing/2016/5/12/chartex" xmlns:cx7="http://schemas.microsoft.com/office/drawing/2016/5/13/chartex" xmlns:cx8="http://schemas.microsoft.com/office/drawing/2016/5/14/chartex" xmlns:mc="http://schemas.openxmlformats.org/markup-compatibility/2006" xmlns:aink="http://schemas.microsoft.com/office/drawing/2016/ink" xmlns:am3d="http://schemas.microsoft.com/office/drawing/2017/model3d" xmlns:o="urn:schemas-microsoft-com:office:office" xmlns:oel="http://schemas.microsoft.com/office/2019/extlst" xmlns:r="http://schemas.openxmlformats.org/officeDocument/2006/relationships" xmlns:m="http://schemas.openxmlformats.org/officeDocument/2006/math" xmlns:v="urn:schemas-microsoft-com:vml" xmlns:wp14="http://schemas.microsoft.com/office/word/2010/wordprocessingDrawing" xmlns:wp="http://schemas.openxmlformats.org/drawingml/2006/wordprocessingDrawing" xmlns:w10="urn:schemas-microsoft-com:office:word" xmlns:w="http://schemas.openxmlformats.org/wordprocessingml/2006/main" xmlns:w14="http://schemas.microsoft.com/office/word/2010/wordml" xmlns:w15="http://schemas.microsoft.com/office/word/2012/wordml" xmlns:w16cex="http://schemas.microsoft.com/office/word/2018/wordml/cex" xmlns:w16cid="http://schemas.microsoft.com/office/word/2016/wordml/cid" xmlns:w16="http://schemas.microsoft.com/office/word/2018/wordml" xmlns:w16du="http://schemas.microsoft.com/office/word/2023/wordml/word16du" xmlns:w16sdtdh="http://schemas.microsoft.com/office/word/2020/wordml/sdtdatahash" xmlns:w16se="http://schemas.microsoft.com/office/word/2015/wordml/symex" xmlns:wpg="http://schemas.microsoft.com/office/word/2010/wordprocessingGroup" xmlns:wpi="http://schemas.microsoft.com/office/word/2010/wordprocessingInk" xmlns:wne="http://schemas.microsoft.com/office/word/2006/wordml" xmlns:wps="http://schemas.microsoft.com/office/word/2010/wordprocessingShape" mc:Ignorable="w14 w15 w16se w16cid w16 w16cex w16sdtdh w16du wp14">
+<w:hdr xmlns:wpc="http://schemas.microsoft.com/office/word/2010/wordprocessingCanvas" xmlns:cx="http://schemas.microsoft.com/office/drawing/2014/chartex" xmlns:cx1="http://schemas.microsoft.com/office/drawing/2015/9/8/chartex" xmlns:cx2="http://schemas.microsoft.com/office/drawing/2015/10/21/chartex" xmlns:cx3="http://schemas.microsoft.com/office/drawing/2016/5/9/chartex" xmlns:cx4="http://schemas.microsoft.com/office/drawing/2016/5/10/chartex" xmlns:cx5="http://schemas.microsoft.com/office/drawing/2016/5/11/chartex" xmlns:cx6="http://schemas.microsoft.com/office/drawing/2016/5/12/chartex" xmlns:cx7="http://schemas.microsoft.com/office/drawing/2016/5/13/chartex" xmlns:cx8="http://schemas.microsoft.com/office/drawing/2016/5/14/chartex" xmlns:mc="http://schemas.openxmlformats.org/markup-compatibility/2006" xmlns:aink="http://schemas.microsoft.com/office/drawing/2016/ink" xmlns:am3d="http://schemas.microsoft.com/office/drawing/2017/model3d" xmlns:o="urn:schemas-microsoft-com:office:office" xmlns:oel="http://schemas.microsoft.com/office/2019/extlst" xmlns:r="http://schemas.openxmlformats.org/officeDocument/2006/relationships" xmlns:m="http://schemas.openxmlformats.org/officeDocument/2006/math" xmlns:v="urn:schemas-microsoft-com:vml" xmlns:wp14="http://schemas.microsoft.com/office/word/2010/wordprocessingDrawing" xmlns:wp="http://schemas.openxmlformats.org/drawingml/2006/wordprocessingDrawing" xmlns:w10="urn:schemas-microsoft-com:office:word" xmlns:w="http://schemas.openxmlformats.org/wordprocessingml/2006/main" xmlns:w14="http://schemas.microsoft.com/office/word/2010/wordml" xmlns:w15="http://schemas.microsoft.com/office/word/2012/wordml" xmlns:w16cex="http://schemas.microsoft.com/office/word/2018/wordml/cex" xmlns:w16cid="http://schemas.microsoft.com/office/word/2016/wordml/cid" xmlns:w16="http://schemas.microsoft.com/office/word/2018/wordml" xmlns:w16du="http://schemas.microsoft.com/office/word/2023/wordml/word16du" xmlns:w16sdtdh="http://schemas.microsoft.com/office/word/2020/wordml/sdtdatahash" xmlns:w16sdtfl="http://schemas.microsoft.com/office/word/2024/wordml/sdtformatlock" xmlns:w16se="http://schemas.microsoft.com/office/word/2015/wordml/symex" xmlns:wpg="http://schemas.microsoft.com/office/word/2010/wordprocessingGroup" xmlns:wpi="http://schemas.microsoft.com/office/word/2010/wordprocessingInk" xmlns:wne="http://schemas.microsoft.com/office/word/2006/wordml" xmlns:wps="http://schemas.microsoft.com/office/word/2010/wordprocessingShape" mc:Ignorable="w14 w15 w16se w16cid w16 w16cex w16sdtdh w16sdtfl w16du wp14">
   <w:p>
     <w:pPr>
       <w:pStyle w:val="Kopfzeile"/>
@@ -3163,7 +3198,7 @@
         <w:szCs w:val="32"/>
         <w:lang w:val="en-US"/>
       </w:rPr>
-      <w:t>Test App.  Event sending over K</w:t>
+      <w:t xml:space="preserve">Test App.  </w:t>
     </w:r>
     <w:r>
       <w:rPr>
@@ -3172,14 +3207,108 @@
         <w:szCs w:val="32"/>
         <w:lang w:val="en-US"/>
       </w:rPr>
-      <w:t>afka incoming_Topic to DB and in case of validation error puts wrong message to error_Topic.</w:t>
+      <w:t>The message</w:t>
+    </w:r>
+    <w:r>
+      <w:rPr>
+        <w:b/>
+        <w:sz w:val="32"/>
+        <w:szCs w:val="32"/>
+        <w:lang w:val="en-US"/>
+      </w:rPr>
+      <w:t xml:space="preserve"> event</w:t>
+    </w:r>
+    <w:r>
+      <w:rPr>
+        <w:b/>
+        <w:sz w:val="32"/>
+        <w:szCs w:val="32"/>
+        <w:lang w:val="en-US"/>
+      </w:rPr>
+      <w:t xml:space="preserve"> </w:t>
+    </w:r>
+    <w:r>
+      <w:rPr>
+        <w:b/>
+        <w:sz w:val="32"/>
+        <w:szCs w:val="32"/>
+        <w:lang w:val="en-US"/>
+      </w:rPr>
+      <w:t>sends</w:t>
+    </w:r>
+    <w:r>
+      <w:rPr>
+        <w:b/>
+        <w:sz w:val="32"/>
+        <w:szCs w:val="32"/>
+        <w:lang w:val="en-US"/>
+      </w:rPr>
+      <w:t xml:space="preserve"> over K</w:t>
+    </w:r>
+    <w:r>
+      <w:rPr>
+        <w:b/>
+        <w:sz w:val="32"/>
+        <w:szCs w:val="32"/>
+        <w:lang w:val="en-US"/>
+      </w:rPr>
+      <w:t xml:space="preserve">afka </w:t>
+    </w:r>
+    <w:proofErr w:type="spellStart"/>
+    <w:r>
+      <w:rPr>
+        <w:b/>
+        <w:sz w:val="32"/>
+        <w:szCs w:val="32"/>
+        <w:lang w:val="en-US"/>
+      </w:rPr>
+      <w:t>incoming_Topic</w:t>
+    </w:r>
+    <w:proofErr w:type="spellEnd"/>
+    <w:r>
+      <w:rPr>
+        <w:b/>
+        <w:sz w:val="32"/>
+        <w:szCs w:val="32"/>
+        <w:lang w:val="en-US"/>
+      </w:rPr>
+      <w:t xml:space="preserve"> to DB and in case of validation error puts wrong message to </w:t>
+    </w:r>
+    <w:proofErr w:type="spellStart"/>
+    <w:r>
+      <w:rPr>
+        <w:b/>
+        <w:sz w:val="32"/>
+        <w:szCs w:val="32"/>
+        <w:lang w:val="en-US"/>
+      </w:rPr>
+      <w:t>error_Topic</w:t>
+    </w:r>
+    <w:proofErr w:type="spellEnd"/>
+    <w:r>
+      <w:rPr>
+        <w:b/>
+        <w:sz w:val="32"/>
+        <w:szCs w:val="32"/>
+        <w:lang w:val="en-US"/>
+      </w:rPr>
+      <w:t xml:space="preserve"> if success then put message to DB</w:t>
+    </w:r>
+    <w:r>
+      <w:rPr>
+        <w:b/>
+        <w:sz w:val="32"/>
+        <w:szCs w:val="32"/>
+        <w:lang w:val="en-US"/>
+      </w:rPr>
+      <w:t>.</w:t>
     </w:r>
   </w:p>
 </w:hdr>
 </file>
 
 <file path=word/header3.xml><?xml version="1.0" encoding="utf-8"?>
-<w:hdr xmlns:wpc="http://schemas.microsoft.com/office/word/2010/wordprocessingCanvas" xmlns:cx="http://schemas.microsoft.com/office/drawing/2014/chartex" xmlns:cx1="http://schemas.microsoft.com/office/drawing/2015/9/8/chartex" xmlns:cx2="http://schemas.microsoft.com/office/drawing/2015/10/21/chartex" xmlns:cx3="http://schemas.microsoft.com/office/drawing/2016/5/9/chartex" xmlns:cx4="http://schemas.microsoft.com/office/drawing/2016/5/10/chartex" xmlns:cx5="http://schemas.microsoft.com/office/drawing/2016/5/11/chartex" xmlns:cx6="http://schemas.microsoft.com/office/drawing/2016/5/12/chartex" xmlns:cx7="http://schemas.microsoft.com/office/drawing/2016/5/13/chartex" xmlns:cx8="http://schemas.microsoft.com/office/drawing/2016/5/14/chartex" xmlns:mc="http://schemas.openxmlformats.org/markup-compatibility/2006" xmlns:aink="http://schemas.microsoft.com/office/drawing/2016/ink" xmlns:am3d="http://schemas.microsoft.com/office/drawing/2017/model3d" xmlns:o="urn:schemas-microsoft-com:office:office" xmlns:oel="http://schemas.microsoft.com/office/2019/extlst" xmlns:r="http://schemas.openxmlformats.org/officeDocument/2006/relationships" xmlns:m="http://schemas.openxmlformats.org/officeDocument/2006/math" xmlns:v="urn:schemas-microsoft-com:vml" xmlns:wp14="http://schemas.microsoft.com/office/word/2010/wordprocessingDrawing" xmlns:wp="http://schemas.openxmlformats.org/drawingml/2006/wordprocessingDrawing" xmlns:w10="urn:schemas-microsoft-com:office:word" xmlns:w="http://schemas.openxmlformats.org/wordprocessingml/2006/main" xmlns:w14="http://schemas.microsoft.com/office/word/2010/wordml" xmlns:w15="http://schemas.microsoft.com/office/word/2012/wordml" xmlns:w16cex="http://schemas.microsoft.com/office/word/2018/wordml/cex" xmlns:w16cid="http://schemas.microsoft.com/office/word/2016/wordml/cid" xmlns:w16="http://schemas.microsoft.com/office/word/2018/wordml" xmlns:w16du="http://schemas.microsoft.com/office/word/2023/wordml/word16du" xmlns:w16sdtdh="http://schemas.microsoft.com/office/word/2020/wordml/sdtdatahash" xmlns:w16se="http://schemas.microsoft.com/office/word/2015/wordml/symex" xmlns:wpg="http://schemas.microsoft.com/office/word/2010/wordprocessingGroup" xmlns:wpi="http://schemas.microsoft.com/office/word/2010/wordprocessingInk" xmlns:wne="http://schemas.microsoft.com/office/word/2006/wordml" xmlns:wps="http://schemas.microsoft.com/office/word/2010/wordprocessingShape" mc:Ignorable="w14 w15 w16se w16cid w16 w16cex w16sdtdh w16du wp14">
+<w:hdr xmlns:wpc="http://schemas.microsoft.com/office/word/2010/wordprocessingCanvas" xmlns:cx="http://schemas.microsoft.com/office/drawing/2014/chartex" xmlns:cx1="http://schemas.microsoft.com/office/drawing/2015/9/8/chartex" xmlns:cx2="http://schemas.microsoft.com/office/drawing/2015/10/21/chartex" xmlns:cx3="http://schemas.microsoft.com/office/drawing/2016/5/9/chartex" xmlns:cx4="http://schemas.microsoft.com/office/drawing/2016/5/10/chartex" xmlns:cx5="http://schemas.microsoft.com/office/drawing/2016/5/11/chartex" xmlns:cx6="http://schemas.microsoft.com/office/drawing/2016/5/12/chartex" xmlns:cx7="http://schemas.microsoft.com/office/drawing/2016/5/13/chartex" xmlns:cx8="http://schemas.microsoft.com/office/drawing/2016/5/14/chartex" xmlns:mc="http://schemas.openxmlformats.org/markup-compatibility/2006" xmlns:aink="http://schemas.microsoft.com/office/drawing/2016/ink" xmlns:am3d="http://schemas.microsoft.com/office/drawing/2017/model3d" xmlns:o="urn:schemas-microsoft-com:office:office" xmlns:oel="http://schemas.microsoft.com/office/2019/extlst" xmlns:r="http://schemas.openxmlformats.org/officeDocument/2006/relationships" xmlns:m="http://schemas.openxmlformats.org/officeDocument/2006/math" xmlns:v="urn:schemas-microsoft-com:vml" xmlns:wp14="http://schemas.microsoft.com/office/word/2010/wordprocessingDrawing" xmlns:wp="http://schemas.openxmlformats.org/drawingml/2006/wordprocessingDrawing" xmlns:w10="urn:schemas-microsoft-com:office:word" xmlns:w="http://schemas.openxmlformats.org/wordprocessingml/2006/main" xmlns:w14="http://schemas.microsoft.com/office/word/2010/wordml" xmlns:w15="http://schemas.microsoft.com/office/word/2012/wordml" xmlns:w16cex="http://schemas.microsoft.com/office/word/2018/wordml/cex" xmlns:w16cid="http://schemas.microsoft.com/office/word/2016/wordml/cid" xmlns:w16="http://schemas.microsoft.com/office/word/2018/wordml" xmlns:w16du="http://schemas.microsoft.com/office/word/2023/wordml/word16du" xmlns:w16sdtdh="http://schemas.microsoft.com/office/word/2020/wordml/sdtdatahash" xmlns:w16sdtfl="http://schemas.microsoft.com/office/word/2024/wordml/sdtformatlock" xmlns:w16se="http://schemas.microsoft.com/office/word/2015/wordml/symex" xmlns:wpg="http://schemas.microsoft.com/office/word/2010/wordprocessingGroup" xmlns:wpi="http://schemas.microsoft.com/office/word/2010/wordprocessingInk" xmlns:wne="http://schemas.microsoft.com/office/word/2006/wordml" xmlns:wps="http://schemas.microsoft.com/office/word/2010/wordprocessingShape" mc:Ignorable="w14 w15 w16se w16cid w16 w16cex w16sdtdh w16sdtfl w16du wp14">
   <w:p>
     <w:pPr>
       <w:pStyle w:val="Kopfzeile"/>
@@ -3189,7 +3318,7 @@
 </file>
 
 <file path=word/styles.xml><?xml version="1.0" encoding="utf-8"?>
-<w:styles xmlns:mc="http://schemas.openxmlformats.org/markup-compatibility/2006" xmlns:r="http://schemas.openxmlformats.org/officeDocument/2006/relationships" xmlns:w="http://schemas.openxmlformats.org/wordprocessingml/2006/main" xmlns:w14="http://schemas.microsoft.com/office/word/2010/wordml" xmlns:w15="http://schemas.microsoft.com/office/word/2012/wordml" xmlns:w16cex="http://schemas.microsoft.com/office/word/2018/wordml/cex" xmlns:w16cid="http://schemas.microsoft.com/office/word/2016/wordml/cid" xmlns:w16="http://schemas.microsoft.com/office/word/2018/wordml" xmlns:w16du="http://schemas.microsoft.com/office/word/2023/wordml/word16du" xmlns:w16sdtdh="http://schemas.microsoft.com/office/word/2020/wordml/sdtdatahash" xmlns:w16se="http://schemas.microsoft.com/office/word/2015/wordml/symex" mc:Ignorable="w14 w15 w16se w16cid w16 w16cex w16sdtdh w16du">
+<w:styles xmlns:mc="http://schemas.openxmlformats.org/markup-compatibility/2006" xmlns:r="http://schemas.openxmlformats.org/officeDocument/2006/relationships" xmlns:w="http://schemas.openxmlformats.org/wordprocessingml/2006/main" xmlns:w14="http://schemas.microsoft.com/office/word/2010/wordml" xmlns:w15="http://schemas.microsoft.com/office/word/2012/wordml" xmlns:w16cex="http://schemas.microsoft.com/office/word/2018/wordml/cex" xmlns:w16cid="http://schemas.microsoft.com/office/word/2016/wordml/cid" xmlns:w16="http://schemas.microsoft.com/office/word/2018/wordml" xmlns:w16du="http://schemas.microsoft.com/office/word/2023/wordml/word16du" xmlns:w16sdtdh="http://schemas.microsoft.com/office/word/2020/wordml/sdtdatahash" xmlns:w16sdtfl="http://schemas.microsoft.com/office/word/2024/wordml/sdtformatlock" xmlns:w16se="http://schemas.microsoft.com/office/word/2015/wordml/symex" mc:Ignorable="w14 w15 w16se w16cid w16 w16cex w16sdtdh w16sdtfl w16du">
   <w:docDefaults>
     <w:rPrDefault>
       <w:rPr>

</xml_diff>